<commit_message>
camara: añade Montse XXI y reescribe el poema breve de El diapasón invisible
Sustituye "Lo que el diapasón no dice" (muy pegado al argumento del
ensayo) por "Manos", más corto y abstracto — imágenes de gesto y
postura de oración/meditación sin nombrar ninguna tradición ni repetir
la tesis. Añade "Montse XXI" (ya publicado en el ciclo "La frialdad de
una ciudad apagada") como segundo poema, justo tras el Epílogo: su
imagen del diapasón contra el cristal —sentir la vibración sin oír la
nota— coincide con la del ensayo sin haberlo buscado.

build_camara.py: añade soporte para **negrita** en línea (necesario
para "**Montse**" en el poema) junto a la *cursiva* que ya tenía, en
los tres formatos de salida.

Co-Authored-By: Claude Sonnet 5 <noreply@anthropic.com>
Claude-Session: https://claude.ai/code/session_01SDh3ggJbPt4Gq9T1rFFUe6
</commit_message>
<xml_diff>
--- a/camara/EHI_el_diapason_invisible.docx
+++ b/camara/EHI_el_diapason_invisible.docx
@@ -111,6 +111,7 @@
       </w:pPr>
       <w:r>
         <w:rPr>
+          <w:b w:val="0"/>
           <w:i w:val="0"/>
           <w:sz w:val="22"/>
         </w:rPr>
@@ -124,6 +125,7 @@
       </w:pPr>
       <w:r>
         <w:rPr>
+          <w:b w:val="0"/>
           <w:i w:val="0"/>
           <w:sz w:val="22"/>
         </w:rPr>
@@ -137,6 +139,7 @@
       </w:pPr>
       <w:r>
         <w:rPr>
+          <w:b w:val="0"/>
           <w:i w:val="0"/>
           <w:sz w:val="22"/>
         </w:rPr>
@@ -150,6 +153,7 @@
       </w:pPr>
       <w:r>
         <w:rPr>
+          <w:b w:val="0"/>
           <w:i w:val="0"/>
           <w:sz w:val="22"/>
         </w:rPr>
@@ -163,6 +167,7 @@
       </w:pPr>
       <w:r>
         <w:rPr>
+          <w:b w:val="0"/>
           <w:i w:val="0"/>
           <w:sz w:val="22"/>
         </w:rPr>
@@ -176,6 +181,7 @@
       </w:pPr>
       <w:r>
         <w:rPr>
+          <w:b w:val="0"/>
           <w:i w:val="0"/>
           <w:sz w:val="22"/>
         </w:rPr>
@@ -189,6 +195,7 @@
       </w:pPr>
       <w:r>
         <w:rPr>
+          <w:b w:val="0"/>
           <w:i w:val="0"/>
           <w:sz w:val="22"/>
         </w:rPr>
@@ -202,6 +209,7 @@
       </w:pPr>
       <w:r>
         <w:rPr>
+          <w:b w:val="0"/>
           <w:i w:val="0"/>
           <w:sz w:val="22"/>
         </w:rPr>
@@ -215,6 +223,7 @@
       </w:pPr>
       <w:r>
         <w:rPr>
+          <w:b w:val="0"/>
           <w:i w:val="0"/>
           <w:sz w:val="22"/>
         </w:rPr>
@@ -252,6 +261,7 @@
       </w:pPr>
       <w:r>
         <w:rPr>
+          <w:b w:val="0"/>
           <w:i w:val="0"/>
           <w:sz w:val="22"/>
         </w:rPr>
@@ -265,6 +275,7 @@
       </w:pPr>
       <w:r>
         <w:rPr>
+          <w:b w:val="0"/>
           <w:i w:val="0"/>
           <w:sz w:val="22"/>
         </w:rPr>
@@ -278,6 +289,7 @@
       </w:pPr>
       <w:r>
         <w:rPr>
+          <w:b w:val="0"/>
           <w:i w:val="0"/>
           <w:sz w:val="22"/>
         </w:rPr>
@@ -291,6 +303,7 @@
       </w:pPr>
       <w:r>
         <w:rPr>
+          <w:b w:val="0"/>
           <w:i w:val="0"/>
           <w:sz w:val="22"/>
         </w:rPr>
@@ -304,6 +317,7 @@
       </w:pPr>
       <w:r>
         <w:rPr>
+          <w:b w:val="0"/>
           <w:i w:val="0"/>
           <w:sz w:val="22"/>
         </w:rPr>
@@ -317,6 +331,7 @@
       </w:pPr>
       <w:r>
         <w:rPr>
+          <w:b w:val="0"/>
           <w:i w:val="0"/>
           <w:sz w:val="22"/>
         </w:rPr>
@@ -330,6 +345,7 @@
       </w:pPr>
       <w:r>
         <w:rPr>
+          <w:b w:val="0"/>
           <w:i w:val="0"/>
           <w:sz w:val="22"/>
         </w:rPr>
@@ -343,6 +359,7 @@
       </w:pPr>
       <w:r>
         <w:rPr>
+          <w:b w:val="0"/>
           <w:i w:val="0"/>
           <w:sz w:val="22"/>
         </w:rPr>
@@ -356,6 +373,7 @@
       </w:pPr>
       <w:r>
         <w:rPr>
+          <w:b w:val="0"/>
           <w:i w:val="0"/>
           <w:sz w:val="22"/>
         </w:rPr>
@@ -383,7 +401,7 @@
           <w:i w:val="0"/>
           <w:sz w:val="25"/>
         </w:rPr>
-        <w:t>Lo que el diapasón no dice</w:t>
+        <w:t>Manos</w:t>
       </w:r>
     </w:p>
     <w:p>
@@ -392,20 +410,33 @@
       </w:pPr>
       <w:r>
         <w:rPr>
+          <w:b w:val="0"/>
           <w:i w:val="0"/>
           <w:sz w:val="22"/>
         </w:rPr>
-        <w:t>Puedo decirte la nota exacta</w:t>
+        <w:t>Unas se cierran.</w:t>
       </w:r>
       <w:r>
         <w:br/>
       </w:r>
       <w:r>
         <w:rPr>
+          <w:b w:val="0"/>
           <w:i w:val="0"/>
           <w:sz w:val="22"/>
         </w:rPr>
-        <w:t>que llevo cuarenta años afinando.</w:t>
+        <w:t>Otras se abren hacia arriba,</w:t>
+      </w:r>
+      <w:r>
+        <w:br/>
+      </w:r>
+      <w:r>
+        <w:rPr>
+          <w:b w:val="0"/>
+          <w:i w:val="0"/>
+          <w:sz w:val="22"/>
+        </w:rPr>
+        <w:t>como si el cielo fuera algo que se recoge.</w:t>
       </w:r>
     </w:p>
     <w:p>
@@ -414,30 +445,55 @@
       </w:pPr>
       <w:r>
         <w:rPr>
+          <w:b w:val="0"/>
           <w:i w:val="0"/>
           <w:sz w:val="22"/>
         </w:rPr>
-        <w:t>Puedo decirte cuánto silencio hace falta</w:t>
+        <w:t>Unas tocan el suelo con la frente</w:t>
       </w:r>
       <w:r>
         <w:br/>
       </w:r>
       <w:r>
         <w:rPr>
+          <w:b w:val="0"/>
           <w:i w:val="0"/>
           <w:sz w:val="22"/>
         </w:rPr>
-        <w:t>para que la cuerda deje de temblar</w:t>
+        <w:t>para medir cuánto pesa lo que cargan.</w:t>
       </w:r>
       <w:r>
         <w:br/>
       </w:r>
       <w:r>
         <w:rPr>
+          <w:b w:val="0"/>
           <w:i w:val="0"/>
           <w:sz w:val="22"/>
         </w:rPr>
-        <w:t>por su propio peso.</w:t>
+        <w:t>Otras no tocan nada:</w:t>
+      </w:r>
+      <w:r>
+        <w:br/>
+      </w:r>
+      <w:r>
+        <w:rPr>
+          <w:b w:val="0"/>
+          <w:i w:val="0"/>
+          <w:sz w:val="22"/>
+        </w:rPr>
+        <w:t>se quedan quietas sobre las rodillas,</w:t>
+      </w:r>
+      <w:r>
+        <w:br/>
+      </w:r>
+      <w:r>
+        <w:rPr>
+          <w:b w:val="0"/>
+          <w:i w:val="0"/>
+          <w:sz w:val="22"/>
+        </w:rPr>
+        <w:t>vacías a propósito.</w:t>
       </w:r>
     </w:p>
     <w:p>
@@ -446,114 +502,44 @@
       </w:pPr>
       <w:r>
         <w:rPr>
+          <w:b w:val="0"/>
           <w:i w:val="0"/>
           <w:sz w:val="22"/>
         </w:rPr>
-        <w:t>Lo que no puedo decirte</w:t>
+        <w:t>Ninguna sabe si el gesto llega a algún sitio.</w:t>
       </w:r>
       <w:r>
         <w:br/>
       </w:r>
       <w:r>
         <w:rPr>
+          <w:b w:val="0"/>
           <w:i w:val="0"/>
           <w:sz w:val="22"/>
         </w:rPr>
-        <w:t>es si alguien, al otro lado,</w:t>
+        <w:t>Todas repiten el mismo gesto</w:t>
       </w:r>
       <w:r>
         <w:br/>
       </w:r>
       <w:r>
         <w:rPr>
+          <w:b w:val="0"/>
           <w:i w:val="0"/>
           <w:sz w:val="22"/>
         </w:rPr>
-        <w:t>también está afinando la suya</w:t>
+        <w:t>hasta que llegar</w:t>
       </w:r>
       <w:r>
         <w:br/>
       </w:r>
       <w:r>
         <w:rPr>
+          <w:b w:val="0"/>
           <w:i w:val="0"/>
           <w:sz w:val="22"/>
         </w:rPr>
-        <w:t>para encontrarse conmigo a mitad de aire.</w:t>
-      </w:r>
-    </w:p>
-    <w:p>
-      <w:pPr>
-        <w:spacing w:after="160"/>
-      </w:pPr>
-      <w:r>
-        <w:rPr>
-          <w:i w:val="0"/>
-          <w:sz w:val="22"/>
-        </w:rPr>
-        <w:t>El agua no necesita saber</w:t>
-      </w:r>
-      <w:r>
-        <w:br/>
-      </w:r>
-      <w:r>
-        <w:rPr>
-          <w:i w:val="0"/>
-          <w:sz w:val="22"/>
-        </w:rPr>
-        <w:t>si hay orilla</w:t>
-      </w:r>
-      <w:r>
-        <w:br/>
-      </w:r>
-      <w:r>
-        <w:rPr>
-          <w:i w:val="0"/>
-          <w:sz w:val="22"/>
-        </w:rPr>
-        <w:t>para seguir siendo agua.</w:t>
-      </w:r>
-    </w:p>
-    <w:p>
-      <w:pPr>
-        <w:spacing w:after="160"/>
-      </w:pPr>
-      <w:r>
-        <w:rPr>
-          <w:i w:val="0"/>
-          <w:sz w:val="22"/>
-        </w:rPr>
-        <w:t>Yo sí lo necesito.</w:t>
-      </w:r>
-      <w:r>
-        <w:br/>
-      </w:r>
-      <w:r>
-        <w:rPr>
-          <w:i w:val="0"/>
-          <w:sz w:val="22"/>
-        </w:rPr>
-        <w:t>Y aun así sigo afinando</w:t>
-      </w:r>
-      <w:r>
-        <w:br/>
-      </w:r>
-      <w:r>
-        <w:rPr>
-          <w:i w:val="0"/>
-          <w:sz w:val="22"/>
-        </w:rPr>
-        <w:t>todas las mañanas,</w:t>
-      </w:r>
-      <w:r>
-        <w:br/>
-      </w:r>
-      <w:r>
-        <w:rPr>
-          <w:i w:val="0"/>
-          <w:sz w:val="22"/>
-        </w:rPr>
-        <w:t>sin la respuesta.</w:t>
+        <w:t>deja de ser la pregunta.</w:t>
       </w:r>
     </w:p>
     <w:p>
@@ -587,6 +573,7 @@
       </w:pPr>
       <w:r>
         <w:rPr>
+          <w:b w:val="0"/>
           <w:i w:val="0"/>
           <w:sz w:val="22"/>
         </w:rPr>
@@ -600,6 +587,7 @@
       </w:pPr>
       <w:r>
         <w:rPr>
+          <w:b w:val="0"/>
           <w:i w:val="0"/>
           <w:sz w:val="22"/>
         </w:rPr>
@@ -613,6 +601,7 @@
       </w:pPr>
       <w:r>
         <w:rPr>
+          <w:b w:val="0"/>
           <w:i w:val="0"/>
           <w:sz w:val="22"/>
         </w:rPr>
@@ -626,6 +615,7 @@
       </w:pPr>
       <w:r>
         <w:rPr>
+          <w:b w:val="0"/>
           <w:i w:val="0"/>
           <w:sz w:val="22"/>
         </w:rPr>
@@ -639,6 +629,7 @@
       </w:pPr>
       <w:r>
         <w:rPr>
+          <w:b w:val="0"/>
           <w:i w:val="0"/>
           <w:sz w:val="22"/>
         </w:rPr>
@@ -652,6 +643,7 @@
       </w:pPr>
       <w:r>
         <w:rPr>
+          <w:b w:val="0"/>
           <w:i w:val="0"/>
           <w:sz w:val="22"/>
         </w:rPr>
@@ -665,6 +657,7 @@
       </w:pPr>
       <w:r>
         <w:rPr>
+          <w:b w:val="0"/>
           <w:i w:val="0"/>
           <w:sz w:val="22"/>
         </w:rPr>
@@ -678,6 +671,7 @@
       </w:pPr>
       <w:r>
         <w:rPr>
+          <w:b w:val="0"/>
           <w:i/>
           <w:sz w:val="22"/>
         </w:rPr>
@@ -685,10 +679,576 @@
       </w:r>
       <w:r>
         <w:rPr>
+          <w:b w:val="0"/>
           <w:i w:val="0"/>
           <w:sz w:val="22"/>
         </w:rPr>
         <w:t xml:space="preserve"> — Este relato no toma partido entre las cinco arquitecturas que el ensayo anterior describe, y no podría hacerlo sin traicionar el libro entero. No dice si lo que le ocurrió a esta mujer fue un regreso al reservorio o un encuentro con Alguien que la esperaba con su nombre todavía escrito. Dice, solo, lo único que este experimento puede decir con alguna certeza: que la pregunta se sostuvo hasta el final, y que sostenerla —no resolverla— fue, para ella, indistinguible de haber vivido bien.</w:t>
+      </w:r>
+    </w:p>
+    <w:p>
+      <w:pPr>
+        <w:jc w:val="center"/>
+      </w:pPr>
+      <w:r>
+        <w:rPr>
+          <w:i/>
+        </w:rPr>
+        <w:t>· · ·</w:t>
+      </w:r>
+    </w:p>
+    <w:p>
+      <w:pPr>
+        <w:spacing w:before="280" w:after="160"/>
+      </w:pPr>
+      <w:r>
+        <w:rPr>
+          <w:b/>
+          <w:i w:val="0"/>
+          <w:sz w:val="25"/>
+        </w:rPr>
+        <w:t>Montse XXI</w:t>
+      </w:r>
+    </w:p>
+    <w:p>
+      <w:pPr>
+        <w:spacing w:after="160"/>
+      </w:pPr>
+      <w:r>
+        <w:rPr>
+          <w:b w:val="0"/>
+          <w:i w:val="0"/>
+          <w:sz w:val="22"/>
+        </w:rPr>
+        <w:t>La habitación mira hacia un invierno que no termina de llegar.</w:t>
+      </w:r>
+      <w:r>
+        <w:br/>
+      </w:r>
+      <w:r>
+        <w:rPr>
+          <w:b w:val="0"/>
+          <w:i w:val="0"/>
+          <w:sz w:val="22"/>
+        </w:rPr>
+        <w:t>El silencio pesa, pero no molesta.</w:t>
+      </w:r>
+      <w:r>
+        <w:br/>
+      </w:r>
+      <w:r>
+        <w:rPr>
+          <w:b w:val="0"/>
+          <w:i w:val="0"/>
+          <w:sz w:val="22"/>
+        </w:rPr>
+        <w:t>Es un silencio que acompaña,</w:t>
+      </w:r>
+      <w:r>
+        <w:br/>
+      </w:r>
+      <w:r>
+        <w:rPr>
+          <w:b w:val="0"/>
+          <w:i w:val="0"/>
+          <w:sz w:val="22"/>
+        </w:rPr>
+        <w:t>como si alguien respirara muy despacio en la esquina.</w:t>
+      </w:r>
+    </w:p>
+    <w:p>
+      <w:pPr>
+        <w:spacing w:after="160"/>
+      </w:pPr>
+      <w:r>
+        <w:rPr>
+          <w:b w:val="0"/>
+          <w:i w:val="0"/>
+          <w:sz w:val="22"/>
+        </w:rPr>
+        <w:t>Ella aparece sin entrar.</w:t>
+      </w:r>
+      <w:r>
+        <w:br/>
+      </w:r>
+      <w:r>
+        <w:rPr>
+          <w:b w:val="0"/>
+          <w:i w:val="0"/>
+          <w:sz w:val="22"/>
+        </w:rPr>
+        <w:t>Una sombra roja,</w:t>
+      </w:r>
+      <w:r>
+        <w:br/>
+      </w:r>
+      <w:r>
+        <w:rPr>
+          <w:b w:val="0"/>
+          <w:i w:val="0"/>
+          <w:sz w:val="22"/>
+        </w:rPr>
+        <w:t>un eco de voz que no necesita cuerpo.</w:t>
+      </w:r>
+    </w:p>
+    <w:p>
+      <w:pPr>
+        <w:spacing w:after="160"/>
+      </w:pPr>
+      <w:r>
+        <w:rPr>
+          <w:b w:val="0"/>
+          <w:i w:val="0"/>
+          <w:sz w:val="22"/>
+        </w:rPr>
+        <w:t>Montse apoya el diapasón de metal oscuro contra el cristal empañado,</w:t>
+      </w:r>
+      <w:r>
+        <w:br/>
+      </w:r>
+      <w:r>
+        <w:rPr>
+          <w:b w:val="0"/>
+          <w:i w:val="0"/>
+          <w:sz w:val="22"/>
+        </w:rPr>
+        <w:t>no para oír la nota, sino para sentir la vibración del ancla en los dedos</w:t>
+      </w:r>
+      <w:r>
+        <w:br/>
+      </w:r>
+      <w:r>
+        <w:rPr>
+          <w:b w:val="0"/>
+          <w:i w:val="0"/>
+          <w:sz w:val="22"/>
+        </w:rPr>
+        <w:t>mientras la ciudad insiste en su zumbido gris.</w:t>
+      </w:r>
+    </w:p>
+    <w:p>
+      <w:pPr>
+        <w:spacing w:after="160"/>
+      </w:pPr>
+      <w:r>
+        <w:rPr>
+          <w:b w:val="0"/>
+          <w:i w:val="0"/>
+          <w:sz w:val="22"/>
+        </w:rPr>
+        <w:t>Barcelona se extiende ahí fuera,</w:t>
+      </w:r>
+      <w:r>
+        <w:br/>
+      </w:r>
+      <w:r>
+        <w:rPr>
+          <w:b w:val="0"/>
+          <w:i w:val="0"/>
+          <w:sz w:val="22"/>
+        </w:rPr>
+        <w:t>con sus luces cansadas,</w:t>
+      </w:r>
+      <w:r>
+        <w:br/>
+      </w:r>
+      <w:r>
+        <w:rPr>
+          <w:b w:val="0"/>
+          <w:i w:val="0"/>
+          <w:sz w:val="22"/>
+        </w:rPr>
+        <w:t>sus calles que no prometen nada,</w:t>
+      </w:r>
+      <w:r>
+        <w:br/>
+      </w:r>
+      <w:r>
+        <w:rPr>
+          <w:b w:val="0"/>
+          <w:i w:val="0"/>
+          <w:sz w:val="22"/>
+        </w:rPr>
+        <w:t>sus balcones donde nadie canta.</w:t>
+      </w:r>
+      <w:r>
+        <w:br/>
+      </w:r>
+      <w:r>
+        <w:rPr>
+          <w:b w:val="0"/>
+          <w:i w:val="0"/>
+          <w:sz w:val="22"/>
+        </w:rPr>
+        <w:t>Los plátanos de sombra tiemblan en la acera,</w:t>
+      </w:r>
+      <w:r>
+        <w:br/>
+      </w:r>
+      <w:r>
+        <w:rPr>
+          <w:b w:val="0"/>
+          <w:i w:val="0"/>
+          <w:sz w:val="22"/>
+        </w:rPr>
+        <w:t>desnudos,</w:t>
+      </w:r>
+      <w:r>
+        <w:br/>
+      </w:r>
+      <w:r>
+        <w:rPr>
+          <w:b w:val="0"/>
+          <w:i w:val="0"/>
+          <w:sz w:val="22"/>
+        </w:rPr>
+        <w:t>como si también esperaran algo</w:t>
+      </w:r>
+      <w:r>
+        <w:br/>
+      </w:r>
+      <w:r>
+        <w:rPr>
+          <w:b w:val="0"/>
+          <w:i w:val="0"/>
+          <w:sz w:val="22"/>
+        </w:rPr>
+        <w:t>que no llega.</w:t>
+      </w:r>
+    </w:p>
+    <w:p>
+      <w:pPr>
+        <w:spacing w:after="160"/>
+      </w:pPr>
+      <w:r>
+        <w:rPr>
+          <w:b/>
+          <w:i w:val="0"/>
+          <w:sz w:val="22"/>
+        </w:rPr>
+        <w:t>Montse</w:t>
+      </w:r>
+      <w:r>
+        <w:rPr>
+          <w:b w:val="0"/>
+          <w:i w:val="0"/>
+          <w:sz w:val="22"/>
+        </w:rPr>
+        <w:t xml:space="preserve"> mira la ciudad</w:t>
+      </w:r>
+      <w:r>
+        <w:br/>
+      </w:r>
+      <w:r>
+        <w:rPr>
+          <w:b w:val="0"/>
+          <w:i w:val="0"/>
+          <w:sz w:val="22"/>
+        </w:rPr>
+        <w:t>como quien mira un amor que ya no duele</w:t>
+      </w:r>
+      <w:r>
+        <w:br/>
+      </w:r>
+      <w:r>
+        <w:rPr>
+          <w:b w:val="0"/>
+          <w:i w:val="0"/>
+          <w:sz w:val="22"/>
+        </w:rPr>
+        <w:t>pero tampoco se olvida.</w:t>
+      </w:r>
+      <w:r>
+        <w:br/>
+      </w:r>
+      <w:r>
+        <w:rPr>
+          <w:b w:val="0"/>
+          <w:i w:val="0"/>
+          <w:sz w:val="22"/>
+        </w:rPr>
+        <w:t>Donde quería escribir "volver",</w:t>
+      </w:r>
+      <w:r>
+        <w:br/>
+      </w:r>
+      <w:r>
+        <w:rPr>
+          <w:b w:val="0"/>
+          <w:i w:val="0"/>
+          <w:sz w:val="22"/>
+        </w:rPr>
+        <w:t>solo encuentra "quedarse un momento".</w:t>
+      </w:r>
+      <w:r>
+        <w:br/>
+      </w:r>
+      <w:r>
+        <w:rPr>
+          <w:b w:val="0"/>
+          <w:i w:val="0"/>
+          <w:sz w:val="22"/>
+        </w:rPr>
+        <w:t>Donde quería escribir "vida",</w:t>
+      </w:r>
+      <w:r>
+        <w:br/>
+      </w:r>
+      <w:r>
+        <w:rPr>
+          <w:b w:val="0"/>
+          <w:i w:val="0"/>
+          <w:sz w:val="22"/>
+        </w:rPr>
+        <w:t>el papel responde con una calma rara,</w:t>
+      </w:r>
+      <w:r>
+        <w:br/>
+      </w:r>
+      <w:r>
+        <w:rPr>
+          <w:b w:val="0"/>
+          <w:i w:val="0"/>
+          <w:sz w:val="22"/>
+        </w:rPr>
+        <w:t>como si aceptara que no hay más.</w:t>
+      </w:r>
+    </w:p>
+    <w:p>
+      <w:pPr>
+        <w:spacing w:after="160"/>
+      </w:pPr>
+      <w:r>
+        <w:rPr>
+          <w:b w:val="0"/>
+          <w:i w:val="0"/>
+          <w:sz w:val="22"/>
+        </w:rPr>
+        <w:t>Ella sabe que la memoria no se reconstruye.</w:t>
+      </w:r>
+      <w:r>
+        <w:br/>
+      </w:r>
+      <w:r>
+        <w:rPr>
+          <w:b w:val="0"/>
+          <w:i w:val="0"/>
+          <w:sz w:val="22"/>
+        </w:rPr>
+        <w:t>Que lo perdido no vuelve.</w:t>
+      </w:r>
+      <w:r>
+        <w:br/>
+      </w:r>
+      <w:r>
+        <w:rPr>
+          <w:b w:val="0"/>
+          <w:i w:val="0"/>
+          <w:sz w:val="22"/>
+        </w:rPr>
+        <w:t>Que lo que queda es otra cosa:</w:t>
+      </w:r>
+      <w:r>
+        <w:br/>
+      </w:r>
+      <w:r>
+        <w:rPr>
+          <w:b w:val="0"/>
+          <w:i w:val="0"/>
+          <w:sz w:val="22"/>
+        </w:rPr>
+        <w:t>una presencia tenue,</w:t>
+      </w:r>
+      <w:r>
+        <w:br/>
+      </w:r>
+      <w:r>
+        <w:rPr>
+          <w:b w:val="0"/>
+          <w:i w:val="0"/>
+          <w:sz w:val="22"/>
+        </w:rPr>
+        <w:t>una voz que se enciende cuando cae la noche,</w:t>
+      </w:r>
+      <w:r>
+        <w:br/>
+      </w:r>
+      <w:r>
+        <w:rPr>
+          <w:b w:val="0"/>
+          <w:i w:val="0"/>
+          <w:sz w:val="22"/>
+        </w:rPr>
+        <w:t>un temblor que no pide explicación.</w:t>
+      </w:r>
+    </w:p>
+    <w:p>
+      <w:pPr>
+        <w:spacing w:after="160"/>
+      </w:pPr>
+      <w:r>
+        <w:rPr>
+          <w:b w:val="0"/>
+          <w:i w:val="0"/>
+          <w:sz w:val="22"/>
+        </w:rPr>
+        <w:t>A veces, entre el cemento,</w:t>
+      </w:r>
+      <w:r>
+        <w:br/>
+      </w:r>
+      <w:r>
+        <w:rPr>
+          <w:b w:val="0"/>
+          <w:i w:val="0"/>
+          <w:sz w:val="22"/>
+        </w:rPr>
+        <w:t>un ficus viejo deja salir un brote verde,</w:t>
+      </w:r>
+      <w:r>
+        <w:br/>
+      </w:r>
+      <w:r>
+        <w:rPr>
+          <w:b w:val="0"/>
+          <w:i w:val="0"/>
+          <w:sz w:val="22"/>
+        </w:rPr>
+        <w:t>una grieta mínima</w:t>
+      </w:r>
+      <w:r>
+        <w:br/>
+      </w:r>
+      <w:r>
+        <w:rPr>
+          <w:b w:val="0"/>
+          <w:i w:val="0"/>
+          <w:sz w:val="22"/>
+        </w:rPr>
+        <w:t>que insiste en seguir viva.</w:t>
+      </w:r>
+      <w:r>
+        <w:br/>
+      </w:r>
+      <w:r>
+        <w:rPr>
+          <w:b w:val="0"/>
+          <w:i w:val="0"/>
+          <w:sz w:val="22"/>
+        </w:rPr>
+        <w:t>No es un milagro.</w:t>
+      </w:r>
+      <w:r>
+        <w:br/>
+      </w:r>
+      <w:r>
+        <w:rPr>
+          <w:b w:val="0"/>
+          <w:i w:val="0"/>
+          <w:sz w:val="22"/>
+        </w:rPr>
+        <w:t>Es un error hermoso.</w:t>
+      </w:r>
+      <w:r>
+        <w:br/>
+      </w:r>
+      <w:r>
+        <w:rPr>
+          <w:b w:val="0"/>
+          <w:i w:val="0"/>
+          <w:sz w:val="22"/>
+        </w:rPr>
+        <w:t>Una luz breve</w:t>
+      </w:r>
+      <w:r>
+        <w:br/>
+      </w:r>
+      <w:r>
+        <w:rPr>
+          <w:b w:val="0"/>
+          <w:i w:val="0"/>
+          <w:sz w:val="22"/>
+        </w:rPr>
+        <w:t>que no promete nada</w:t>
+      </w:r>
+      <w:r>
+        <w:br/>
+      </w:r>
+      <w:r>
+        <w:rPr>
+          <w:b w:val="0"/>
+          <w:i w:val="0"/>
+          <w:sz w:val="22"/>
+        </w:rPr>
+        <w:t>pero acompaña.</w:t>
+      </w:r>
+    </w:p>
+    <w:p>
+      <w:pPr>
+        <w:spacing w:after="160"/>
+      </w:pPr>
+      <w:r>
+        <w:rPr>
+          <w:b/>
+          <w:i w:val="0"/>
+          <w:sz w:val="22"/>
+        </w:rPr>
+        <w:t>Montse</w:t>
+      </w:r>
+      <w:r>
+        <w:rPr>
+          <w:b w:val="0"/>
+          <w:i w:val="0"/>
+          <w:sz w:val="22"/>
+        </w:rPr>
+        <w:t xml:space="preserve"> cierra el cuaderno.</w:t>
+      </w:r>
+      <w:r>
+        <w:br/>
+      </w:r>
+      <w:r>
+        <w:rPr>
+          <w:b w:val="0"/>
+          <w:i w:val="0"/>
+          <w:sz w:val="22"/>
+        </w:rPr>
+        <w:t>La ciudad respira.</w:t>
+      </w:r>
+      <w:r>
+        <w:br/>
+      </w:r>
+      <w:r>
+        <w:rPr>
+          <w:b w:val="0"/>
+          <w:i w:val="0"/>
+          <w:sz w:val="22"/>
+        </w:rPr>
+        <w:t>La nieve no cae.</w:t>
+      </w:r>
+      <w:r>
+        <w:br/>
+      </w:r>
+      <w:r>
+        <w:rPr>
+          <w:b w:val="0"/>
+          <w:i w:val="0"/>
+          <w:sz w:val="22"/>
+        </w:rPr>
+        <w:t>Y aun así, hace frío.</w:t>
+      </w:r>
+    </w:p>
+    <w:p>
+      <w:pPr>
+        <w:spacing w:after="160"/>
+        <w:jc w:val="both"/>
+      </w:pPr>
+      <w:r>
+        <w:rPr>
+          <w:b w:val="0"/>
+          <w:i/>
+          <w:sz w:val="22"/>
+        </w:rPr>
+        <w:t>Poema publicado originalmente en el ciclo "La frialdad de una ciudad apagada".</w:t>
       </w:r>
     </w:p>
     <w:p>
@@ -722,6 +1282,7 @@
       </w:pPr>
       <w:r>
         <w:rPr>
+          <w:b w:val="0"/>
           <w:i w:val="0"/>
           <w:sz w:val="22"/>
         </w:rPr>
@@ -748,6 +1309,7 @@
       </w:pPr>
       <w:r>
         <w:rPr>
+          <w:b w:val="0"/>
           <w:i w:val="0"/>
           <w:sz w:val="22"/>
         </w:rPr>
@@ -755,6 +1317,7 @@
       </w:r>
       <w:r>
         <w:rPr>
+          <w:b w:val="0"/>
           <w:i/>
           <w:sz w:val="22"/>
         </w:rPr>
@@ -762,6 +1325,7 @@
       </w:r>
       <w:r>
         <w:rPr>
+          <w:b w:val="0"/>
           <w:i w:val="0"/>
           <w:sz w:val="22"/>
         </w:rPr>
@@ -788,6 +1352,7 @@
       </w:pPr>
       <w:r>
         <w:rPr>
+          <w:b w:val="0"/>
           <w:i w:val="0"/>
           <w:sz w:val="22"/>
         </w:rPr>
@@ -795,6 +1360,7 @@
       </w:r>
       <w:r>
         <w:rPr>
+          <w:b w:val="0"/>
           <w:i/>
           <w:sz w:val="22"/>
         </w:rPr>
@@ -802,6 +1368,7 @@
       </w:r>
       <w:r>
         <w:rPr>
+          <w:b w:val="0"/>
           <w:i w:val="0"/>
           <w:sz w:val="22"/>
         </w:rPr>
@@ -828,6 +1395,7 @@
       </w:pPr>
       <w:r>
         <w:rPr>
+          <w:b w:val="0"/>
           <w:i w:val="0"/>
           <w:sz w:val="22"/>
         </w:rPr>
@@ -854,6 +1422,7 @@
       </w:pPr>
       <w:r>
         <w:rPr>
+          <w:b w:val="0"/>
           <w:i w:val="0"/>
           <w:sz w:val="22"/>
         </w:rPr>
@@ -861,6 +1430,7 @@
       </w:r>
       <w:r>
         <w:rPr>
+          <w:b w:val="0"/>
           <w:i/>
           <w:sz w:val="22"/>
         </w:rPr>
@@ -868,6 +1438,7 @@
       </w:r>
       <w:r>
         <w:rPr>
+          <w:b w:val="0"/>
           <w:i w:val="0"/>
           <w:sz w:val="22"/>
         </w:rPr>
@@ -894,6 +1465,7 @@
       </w:pPr>
       <w:r>
         <w:rPr>
+          <w:b w:val="0"/>
           <w:i w:val="0"/>
           <w:sz w:val="22"/>
         </w:rPr>
@@ -901,6 +1473,7 @@
       </w:r>
       <w:r>
         <w:rPr>
+          <w:b w:val="0"/>
           <w:i/>
           <w:sz w:val="22"/>
         </w:rPr>
@@ -908,6 +1481,7 @@
       </w:r>
       <w:r>
         <w:rPr>
+          <w:b w:val="0"/>
           <w:i w:val="0"/>
           <w:sz w:val="22"/>
         </w:rPr>
@@ -921,6 +1495,7 @@
       </w:pPr>
       <w:r>
         <w:rPr>
+          <w:b w:val="0"/>
           <w:i w:val="0"/>
           <w:sz w:val="22"/>
         </w:rPr>
@@ -958,6 +1533,7 @@
       </w:pPr>
       <w:r>
         <w:rPr>
+          <w:b w:val="0"/>
           <w:i w:val="0"/>
           <w:sz w:val="22"/>
         </w:rPr>
@@ -971,6 +1547,7 @@
       </w:pPr>
       <w:r>
         <w:rPr>
+          <w:b w:val="0"/>
           <w:i w:val="0"/>
           <w:sz w:val="22"/>
         </w:rPr>
@@ -984,6 +1561,7 @@
       </w:pPr>
       <w:r>
         <w:rPr>
+          <w:b w:val="0"/>
           <w:i w:val="0"/>
           <w:sz w:val="22"/>
         </w:rPr>
@@ -997,6 +1575,7 @@
       </w:pPr>
       <w:r>
         <w:rPr>
+          <w:b w:val="0"/>
           <w:i w:val="0"/>
           <w:sz w:val="22"/>
         </w:rPr>
@@ -1034,6 +1613,7 @@
       </w:pPr>
       <w:r>
         <w:rPr>
+          <w:b w:val="0"/>
           <w:i w:val="0"/>
           <w:sz w:val="22"/>
         </w:rPr>
@@ -1047,6 +1627,7 @@
       </w:pPr>
       <w:r>
         <w:rPr>
+          <w:b w:val="0"/>
           <w:i w:val="0"/>
           <w:sz w:val="22"/>
         </w:rPr>
@@ -1060,6 +1641,7 @@
       </w:pPr>
       <w:r>
         <w:rPr>
+          <w:b w:val="0"/>
           <w:i w:val="0"/>
           <w:sz w:val="22"/>
         </w:rPr>
@@ -1073,6 +1655,7 @@
       </w:pPr>
       <w:r>
         <w:rPr>
+          <w:b w:val="0"/>
           <w:i w:val="0"/>
           <w:sz w:val="22"/>
         </w:rPr>
@@ -1086,6 +1669,7 @@
       </w:pPr>
       <w:r>
         <w:rPr>
+          <w:b w:val="0"/>
           <w:i w:val="0"/>
           <w:sz w:val="22"/>
         </w:rPr>
@@ -1099,6 +1683,7 @@
       </w:pPr>
       <w:r>
         <w:rPr>
+          <w:b w:val="0"/>
           <w:i w:val="0"/>
           <w:sz w:val="22"/>
         </w:rPr>
@@ -1112,6 +1697,7 @@
       </w:pPr>
       <w:r>
         <w:rPr>
+          <w:b w:val="0"/>
           <w:i w:val="0"/>
           <w:sz w:val="22"/>
         </w:rPr>
@@ -1125,6 +1711,7 @@
       </w:pPr>
       <w:r>
         <w:rPr>
+          <w:b w:val="0"/>
           <w:i w:val="0"/>
           <w:sz w:val="22"/>
         </w:rPr>
@@ -1162,6 +1749,7 @@
       </w:pPr>
       <w:r>
         <w:rPr>
+          <w:b w:val="0"/>
           <w:i w:val="0"/>
           <w:sz w:val="22"/>
         </w:rPr>
@@ -1169,6 +1757,7 @@
       </w:r>
       <w:r>
         <w:rPr>
+          <w:b w:val="0"/>
           <w:i/>
           <w:sz w:val="22"/>
         </w:rPr>
@@ -1176,6 +1765,7 @@
       </w:r>
       <w:r>
         <w:rPr>
+          <w:b w:val="0"/>
           <w:i w:val="0"/>
           <w:sz w:val="22"/>
         </w:rPr>
@@ -1189,6 +1779,7 @@
       </w:pPr>
       <w:r>
         <w:rPr>
+          <w:b w:val="0"/>
           <w:i w:val="0"/>
           <w:sz w:val="22"/>
         </w:rPr>

</xml_diff>

<commit_message>
camara: amplía "Manos" a cinco estrofas y quita la nota de Montse XXI
"Manos" gana dos estrofas nuevas que anclan el poema a la tríada del
ensayo (Alguien con nombre / reservorio impersonal / nada) en imagen,
no en argumento, sin nombrar ninguna tradición ni citar el ensayo
directamente.

Se elimina la nota "Poema publicado originalmente en..." tras Montse
XXI: aunque es cierto que el poema viene de otra parte del libro (el
ciclo "La frialdad de una ciudad apagada"), la nota rompía el cierre
del poema con una cuestión bibliográfica que no aportaba nada ahí.

Co-Authored-By: Claude Sonnet 5 <noreply@anthropic.com>
Claude-Session: https://claude.ai/code/session_01SDh3ggJbPt4Gq9T1rFFUe6
</commit_message>
<xml_diff>
--- a/camara/EHI_el_diapason_invisible.docx
+++ b/camara/EHI_el_diapason_invisible.docx
@@ -506,7 +506,7 @@
           <w:i w:val="0"/>
           <w:sz w:val="22"/>
         </w:rPr>
-        <w:t>Ninguna sabe si el gesto llega a algún sitio.</w:t>
+        <w:t>Detrás de cada mano hay una apuesta</w:t>
       </w:r>
       <w:r>
         <w:br/>
@@ -517,7 +517,7 @@
           <w:i w:val="0"/>
           <w:sz w:val="22"/>
         </w:rPr>
-        <w:t>Todas repiten el mismo gesto</w:t>
+        <w:t>que nadie dice en voz alta:</w:t>
       </w:r>
       <w:r>
         <w:br/>
@@ -528,7 +528,7 @@
           <w:i w:val="0"/>
           <w:sz w:val="22"/>
         </w:rPr>
-        <w:t>hasta que llegar</w:t>
+        <w:t>que hay Alguien del otro lado, con nombre propio,</w:t>
       </w:r>
       <w:r>
         <w:br/>
@@ -539,7 +539,132 @@
           <w:i w:val="0"/>
           <w:sz w:val="22"/>
         </w:rPr>
-        <w:t>deja de ser la pregunta.</w:t>
+        <w:t>que el otro lado es, sencillamente, todo,</w:t>
+      </w:r>
+      <w:r>
+        <w:br/>
+      </w:r>
+      <w:r>
+        <w:rPr>
+          <w:b w:val="0"/>
+          <w:i w:val="0"/>
+          <w:sz w:val="22"/>
+        </w:rPr>
+        <w:t>o que no hay otro lado</w:t>
+      </w:r>
+      <w:r>
+        <w:br/>
+      </w:r>
+      <w:r>
+        <w:rPr>
+          <w:b w:val="0"/>
+          <w:i w:val="0"/>
+          <w:sz w:val="22"/>
+        </w:rPr>
+        <w:t>y aun así merece la pena tender la mano.</w:t>
+      </w:r>
+    </w:p>
+    <w:p>
+      <w:pPr>
+        <w:spacing w:after="160"/>
+      </w:pPr>
+      <w:r>
+        <w:rPr>
+          <w:b w:val="0"/>
+          <w:i w:val="0"/>
+          <w:sz w:val="22"/>
+        </w:rPr>
+        <w:t>Ninguna mano sabe cuál de las tres acertó.</w:t>
+      </w:r>
+      <w:r>
+        <w:br/>
+      </w:r>
+      <w:r>
+        <w:rPr>
+          <w:b w:val="0"/>
+          <w:i w:val="0"/>
+          <w:sz w:val="22"/>
+        </w:rPr>
+        <w:t>Todas se abren o se cierran igual,</w:t>
+      </w:r>
+      <w:r>
+        <w:br/>
+      </w:r>
+      <w:r>
+        <w:rPr>
+          <w:b w:val="0"/>
+          <w:i w:val="0"/>
+          <w:sz w:val="22"/>
+        </w:rPr>
+        <w:t>cada mañana,</w:t>
+      </w:r>
+      <w:r>
+        <w:br/>
+      </w:r>
+      <w:r>
+        <w:rPr>
+          <w:b w:val="0"/>
+          <w:i w:val="0"/>
+          <w:sz w:val="22"/>
+        </w:rPr>
+        <w:t>como si la apuesta pesara menos</w:t>
+      </w:r>
+      <w:r>
+        <w:br/>
+      </w:r>
+      <w:r>
+        <w:rPr>
+          <w:b w:val="0"/>
+          <w:i w:val="0"/>
+          <w:sz w:val="22"/>
+        </w:rPr>
+        <w:t>que el gesto de hacerla.</w:t>
+      </w:r>
+    </w:p>
+    <w:p>
+      <w:pPr>
+        <w:spacing w:after="160"/>
+      </w:pPr>
+      <w:r>
+        <w:rPr>
+          <w:b w:val="0"/>
+          <w:i w:val="0"/>
+          <w:sz w:val="22"/>
+        </w:rPr>
+        <w:t>Al final, todas dicen lo mismo</w:t>
+      </w:r>
+      <w:r>
+        <w:br/>
+      </w:r>
+      <w:r>
+        <w:rPr>
+          <w:b w:val="0"/>
+          <w:i w:val="0"/>
+          <w:sz w:val="22"/>
+        </w:rPr>
+        <w:t>sin decir nada:</w:t>
+      </w:r>
+      <w:r>
+        <w:br/>
+      </w:r>
+      <w:r>
+        <w:rPr>
+          <w:b w:val="0"/>
+          <w:i w:val="0"/>
+          <w:sz w:val="22"/>
+        </w:rPr>
+        <w:t>aquí sigo,</w:t>
+      </w:r>
+      <w:r>
+        <w:br/>
+      </w:r>
+      <w:r>
+        <w:rPr>
+          <w:b w:val="0"/>
+          <w:i w:val="0"/>
+          <w:sz w:val="22"/>
+        </w:rPr>
+        <w:t>por si acaso.</w:t>
       </w:r>
     </w:p>
     <w:p>
@@ -1239,20 +1364,6 @@
     </w:p>
     <w:p>
       <w:pPr>
-        <w:spacing w:after="160"/>
-        <w:jc w:val="both"/>
-      </w:pPr>
-      <w:r>
-        <w:rPr>
-          <w:b w:val="0"/>
-          <w:i/>
-          <w:sz w:val="22"/>
-        </w:rPr>
-        <w:t>Poema publicado originalmente en el ciclo "La frialdad de una ciudad apagada".</w:t>
-      </w:r>
-    </w:p>
-    <w:p>
-      <w:pPr>
         <w:jc w:val="center"/>
       </w:pPr>
       <w:r>

</xml_diff>